<commit_message>
Update plan doc: Phi window wording, tech stack, repo tree, cap and centering rules
</commit_message>
<xml_diff>
--- a/docs/Sharpee_Project_Plan_v2.docx
+++ b/docs/Sharpee_Project_Plan_v2.docx
@@ -521,7 +521,7 @@
                 <w:color w:val="FFFFFF"/>
                 <w:sz w:val="18"/>
               </w:rPr>
-              <w:t xml:space="preserve">Constraints run inside one portfolio function shared by training and backtesting, so the model is trained on the portfolio it is judged on.</w:t>
+              <w:t xml:space="preserve">Constraints run inside one portfolio function shared by training and backtesting, so the model is trained on the portfolio it is judged on. The position cap applies to residual positions before hedging: capping stock weights after hedging was found to break the factor hedge.</w:t>
             </w:r>
           </w:p>
         </w:tc>
@@ -1430,7 +1430,7 @@
                 <w:b w:val="0"/>
                 <w:sz w:val="16"/>
               </w:rPr>
-              <w:t>scikit-learn</w:t>
+              <w:t xml:space="preserve">NumPy</w:t>
             </w:r>
           </w:p>
         </w:tc>
@@ -1449,7 +1449,7 @@
                 <w:b w:val="0"/>
                 <w:sz w:val="16"/>
               </w:rPr>
-              <w:t>PCA and preprocessing.</w:t>
+              <w:t xml:space="preserve">PCA via eigendecomposition of the correlation matrix.</w:t>
             </w:r>
           </w:p>
         </w:tc>
@@ -1489,7 +1489,7 @@
                 <w:b w:val="0"/>
                 <w:sz w:val="16"/>
               </w:rPr>
-              <w:t xml:space="preserve">statsmodels, SciPy</w:t>
+              <w:t xml:space="preserve">NumPy, SciPy</w:t>
             </w:r>
           </w:p>
         </w:tc>
@@ -2079,7 +2079,7 @@
     </w:p>
     <w:p>
       <w:r>
-        <w:t xml:space="preserve">Row i of Phi is a tradable portfolio: long stock i, short beta(i) units of each eigenportfolio. Section 9 uses Phi to turn residual positions into stock weights. Each day's residual uses the Phi in force on that day.</w:t>
+        <w:t xml:space="preserve">Row i of Phi is a tradable portfolio: long stock i, short beta(i) units of each eigenportfolio. Section 9 uses Phi to turn residual positions into stock weights. On each decision date, the trailing residual history is computed with the Phi in force on that date, so a window never mixes two factor models and no data after that date is used.</w:t>
       </w:r>
     </w:p>
     <w:p>
@@ -2927,17 +2927,17 @@
     </w:p>
     <w:p>
       <w:r>
-        <w:t xml:space="preserve">Convert scores into portfolio weights in two steps. First, in residual space, center the scores across eligible stocks and L1-normalize them to get residual weights w(t). Second, map them to stock weights through the residual matrix from Section 5:</w:t>
+        <w:t xml:space="preserve">Convert scores into portfolio weights in two steps. First, in residual space, demean model scores across tradable stocks (so a constant output holds nothing; OU's +1/-1 positions are used as they are, as in Avellaneda-Lee), L1-normalize them and cap each residual position at 2% to get w(t). Clipped weight is not redistributed, so a concentrated signal gives a smaller book. Second, map w(t) to stock weights through the residual matrix from Section 5:</w:t>
       </w:r>
     </w:p>
     <w:p>
       <w:r>
-        <w:t xml:space="preserve">x(t) = normalize_L1( Phi(t)^T w(t) ),   then cap single names and renormalize</w:t>
+        <w:t xml:space="preserve">x(t) = Phi(t)^T w(t),   rescaled so that sum|x| = sum|w| &lt;= 1</w:t>
       </w:r>
     </w:p>
     <w:p>
       <w:r>
-        <w:t xml:space="preserve">Holding residual i means holding stock i and shorting beta(i) units of each eigenportfolio, so x(t) is close to factor-neutral by construction. One PyTorch function implements this mapping and the constraints of Section 10, and both training and backtesting call it, so the model is trained on exactly the portfolio it is judged on.</w:t>
+        <w:t xml:space="preserve">Holding residual i means holding stock i and shorting beta(i) units of each eigenportfolio, so x(t) is close to factor-neutral by construction. The cap must act on w, not on x: clipping a stock weight after hedging cuts the stock leg but keeps its hedge legs, which leaves the book exposed to the market (a trained model found and exploited exactly that). One PyTorch function implements this mapping and the constraints of Section 10, and both training and backtesting call it, so the model is trained on exactly the portfolio it is judged on.</w:t>
       </w:r>
     </w:p>
     <w:p>
@@ -3170,7 +3170,7 @@
                 <w:b w:val="0"/>
                 <w:sz w:val="17"/>
               </w:rPr>
-              <w:t xml:space="preserve">L1-normalize stock weights x to 1.0.</w:t>
+              <w:t xml:space="preserve">At most 1.0: sum|x| = sum|w|, below 1 only when positions hit the cap.</w:t>
             </w:r>
           </w:p>
         </w:tc>
@@ -3210,7 +3210,7 @@
                 <w:b w:val="0"/>
                 <w:sz w:val="17"/>
               </w:rPr>
-              <w:t xml:space="preserve">Illustrative 2% cap on |x(i,t)|, applied inside the shared portfolio function, then renormalize; test sensitivity.</w:t>
+              <w:t xml:space="preserve">2% cap on each residual position |w(i,t)|, applied before hedging so the factor hedge stays intact; monitor the stock-space maximum |x(i,t)|.</w:t>
             </w:r>
           </w:p>
         </w:tc>
@@ -4628,7 +4628,13 @@
         <w:br/>
         <w:t xml:space="preserve">│   ├── data.yaml</w:t>
         <w:br/>
+        <w:t xml:space="preserve">│   ├── experiment.yaml</w:t>
+        <w:br/>
         <w:t xml:space="preserve">│   ├── baseline.yaml</w:t>
+        <w:br/>
+        <w:t xml:space="preserve">│   ├── mlp.yaml</w:t>
+        <w:br/>
+        <w:t xml:space="preserve">│   ├── temporal_cnn.yaml</w:t>
         <w:br/>
         <w:t xml:space="preserve">│   └── transformer.yaml</w:t>
         <w:br/>
@@ -4644,25 +4650,29 @@
         <w:br/>
         <w:t xml:space="preserve">│   ├── 01_data_exploration.ipynb</w:t>
         <w:br/>
-        <w:t xml:space="preserve">│   └── 02_residual_analysis.ipynb</w:t>
+        <w:t xml:space="preserve">│   ├── 02_residual_analysis.ipynb</w:t>
+        <w:br/>
+        <w:t xml:space="preserve">│   └── 03_train_models.ipynb</w:t>
         <w:br/>
         <w:t xml:space="preserve">├── src/sharpee/</w:t>
         <w:br/>
-        <w:t xml:space="preserve">│   ├── data/                # download.py, universe.py, preprocess.py</w:t>
+        <w:t xml:space="preserve">│   ├── data/                # download.py, universe.py, preprocess.py, synthetic.py</w:t>
         <w:br/>
-        <w:t xml:space="preserve">│   ├── features/            # returns.py, pca_residuals.py</w:t>
+        <w:t xml:space="preserve">│   ├── features/            # returns.py, pca_residuals.py, diagnostics.py</w:t>
         <w:br/>
         <w:t xml:space="preserve">│   ├── strategies/          # ou_strategy.py</w:t>
         <w:br/>
-        <w:t xml:space="preserve">│   ├── models/              # blocks.py, mlp.py, transformer.py, temporal_cnn.py</w:t>
+        <w:t xml:space="preserve">│   ├── models/              # blocks.py, mlp.py, temporal_cnn.py, transformer.py</w:t>
         <w:br/>
         <w:t xml:space="preserve">│   ├── portfolio/           # construction.py, risk.py</w:t>
         <w:br/>
         <w:t xml:space="preserve">│   ├── backtest/            # engine.py, costs.py</w:t>
         <w:br/>
-        <w:t xml:space="preserve">│   ├── training/            # dataset.py, loss.py, train.py, trials.py</w:t>
+        <w:t xml:space="preserve">│   ├── training/            # dataset.py, loss.py, train.py, trials.py, tuning.py</w:t>
         <w:br/>
-        <w:t xml:space="preserve">│   └── evaluation/          # metrics.py, walk_forward.py, significance.py</w:t>
+        <w:t xml:space="preserve">│   ├── evaluation/          # metrics.py, walk_forward.py, significance.py</w:t>
+        <w:br/>
+        <w:t xml:space="preserve">│   └── pipeline.py          # processed data + cached residual panel</w:t>
         <w:br/>
         <w:t xml:space="preserve">├── app/</w:t>
         <w:br/>
@@ -4682,6 +4692,8 @@
         <w:br/>
         <w:t xml:space="preserve">│   ├── test_metrics.py</w:t>
         <w:br/>
+        <w:t xml:space="preserve">│   ├── test_models.py</w:t>
+        <w:br/>
         <w:t xml:space="preserve">│   └── test_loss.py</w:t>
         <w:br/>
         <w:t xml:space="preserve">├── runs/                    # trial log and checkpoints; gitignored</w:t>
@@ -4690,7 +4702,7 @@
         <w:br/>
         <w:t xml:space="preserve">│   ├── figures/</w:t>
         <w:br/>
-        <w:t xml:space="preserve">│   └── research_report.md</w:t>
+        <w:t xml:space="preserve">│   └── README.md            # findings write-up</w:t>
         <w:br/>
         <w:t xml:space="preserve">└── scripts/</w:t>
         <w:br/>
@@ -4699,6 +4711,8 @@
         <w:t xml:space="preserve">    ├── run_baseline.py</w:t>
         <w:br/>
         <w:t xml:space="preserve">    ├── train_model.py</w:t>
+        <w:br/>
+        <w:t xml:space="preserve">    ├── sanity_synthetic.py</w:t>
         <w:br/>
         <w:t xml:space="preserve">    └── run_backtest.py</w:t>
       </w:r>

</xml_diff>